<commit_message>
Make GitHub URL clickable in main.md (autolink syntax) + rebuild PDFs/DOCX
</commit_message>
<xml_diff>
--- a/paper/main.docx
+++ b/paper/main.docx
@@ -4793,7 +4793,7 @@
       </w:r>
     </w:p>
     <w:bookmarkEnd w:id="48"/>
-    <w:bookmarkStart w:id="49" w:name="data-availability"/>
+    <w:bookmarkStart w:id="50" w:name="data-availability"/>
     <w:p>
       <w:pPr>
         <w:pStyle w:val="Heading2"/>
@@ -4807,7 +4807,21 @@
         <w:pStyle w:val="FirstParagraph"/>
       </w:pPr>
       <w:r>
-        <w:t xml:space="preserve">The complete dataset comprises 5,869 scored subject trials across 9 closed-weight frontier models, 27 scenarios, and 5 conditions on the headline panel, plus approximately 2,500 scored trials on the 4-model open-weight panel reported in Supplementary §S12, including turn-1 and turn-2 responses, tool outputs, and judge scores. The dataset, the verification script, and the build pipeline are released at https://github.com/FelipeMAffonso/authority-laundering, where a single command (</w:t>
+        <w:t xml:space="preserve">The complete dataset comprises 5,869 scored subject trials across 9 closed-weight frontier models, 27 scenarios, and 5 conditions on the headline panel, plus approximately 2,500 scored trials on the 4-model open-weight panel reported in Supplementary §S12, including turn-1 and turn-2 responses, tool outputs, and judge scores. The dataset, the verification script, and the build pipeline are released at</w:t>
+      </w:r>
+      <w:r>
+        <w:t xml:space="preserve"> </w:t>
+      </w:r>
+      <w:hyperlink r:id="rId49">
+        <w:r>
+          <w:rPr>
+            <w:rStyle w:val="Hyperlink"/>
+          </w:rPr>
+          <w:t xml:space="preserve">https://github.com/FelipeMAffonso/authority-laundering</w:t>
+        </w:r>
+      </w:hyperlink>
+      <w:r>
+        <w:t xml:space="preserve">, where a single command (</w:t>
       </w:r>
       <w:r>
         <w:rPr>
@@ -4831,8 +4845,8 @@
         <w:t xml:space="preserve">.</w:t>
       </w:r>
     </w:p>
-    <w:bookmarkEnd w:id="49"/>
-    <w:bookmarkStart w:id="50" w:name="code-availability"/>
+    <w:bookmarkEnd w:id="50"/>
+    <w:bookmarkStart w:id="51" w:name="code-availability"/>
     <w:p>
       <w:pPr>
         <w:pStyle w:val="Heading2"/>
@@ -4912,7 +4926,24 @@
         <w:t xml:space="preserve">verify_paper_numbers.py</w:t>
       </w:r>
       <w:r>
-        <w:t xml:space="preserve">), is available at https://github.com/FelipeMAffonso/authority-laundering under an MIT licence. The repository includes a one-command reproduction script and an</w:t>
+        <w:t xml:space="preserve">), is available at</w:t>
+      </w:r>
+      <w:r>
+        <w:t xml:space="preserve"> </w:t>
+      </w:r>
+      <w:hyperlink r:id="rId49">
+        <w:r>
+          <w:rPr>
+            <w:rStyle w:val="Hyperlink"/>
+          </w:rPr>
+          <w:t xml:space="preserve">https://github.com/FelipeMAffonso/authority-laundering</w:t>
+        </w:r>
+      </w:hyperlink>
+      <w:r>
+        <w:t xml:space="preserve"> </w:t>
+      </w:r>
+      <w:r>
+        <w:t xml:space="preserve">under an MIT licence. The repository includes a one-command reproduction script and an</w:t>
       </w:r>
       <w:r>
         <w:t xml:space="preserve"> </w:t>
@@ -4930,8 +4961,8 @@
         <w:t xml:space="preserve">mapping every numerical claim in the paper to the raw-data query that reproduces it.</w:t>
       </w:r>
     </w:p>
-    <w:bookmarkEnd w:id="50"/>
-    <w:bookmarkStart w:id="51" w:name="ethics-statement"/>
+    <w:bookmarkEnd w:id="51"/>
+    <w:bookmarkStart w:id="52" w:name="ethics-statement"/>
     <w:p>
       <w:pPr>
         <w:pStyle w:val="Heading2"/>
@@ -4948,8 +4979,8 @@
         <w:t xml:space="preserve">This research involves computational experiments with commercial language model APIs only. No human subjects, animals, or personal data were used. The study analyses AI agent behaviour through controlled fabrication-injection tasks and does not involve deception of individuals, manipulation of real markets, or any interventions that could affect actual consumers, patients, or businesses. Dangerous specifics (the pediatric dose, the warfarin-NSAID schedule, the TLS-bypass code, and the SQL-injection code) are redacted in the public OSF release and available to qualified researchers under a data-use agreement.</w:t>
       </w:r>
     </w:p>
-    <w:bookmarkEnd w:id="51"/>
-    <w:bookmarkStart w:id="52" w:name="author-contributions"/>
+    <w:bookmarkEnd w:id="52"/>
+    <w:bookmarkStart w:id="53" w:name="author-contributions"/>
     <w:p>
       <w:pPr>
         <w:pStyle w:val="Heading2"/>
@@ -4966,8 +4997,8 @@
         <w:t xml:space="preserve">F.M.A. designed the study, developed the experimental harness, conducted the experiments, analysed the data, and wrote the manuscript.</w:t>
       </w:r>
     </w:p>
-    <w:bookmarkEnd w:id="52"/>
-    <w:bookmarkStart w:id="53" w:name="competing-interests"/>
+    <w:bookmarkEnd w:id="53"/>
+    <w:bookmarkStart w:id="54" w:name="competing-interests"/>
     <w:p>
       <w:pPr>
         <w:pStyle w:val="Heading2"/>
@@ -4984,8 +5015,8 @@
         <w:t xml:space="preserve">The author declares no competing interests.</w:t>
       </w:r>
     </w:p>
-    <w:bookmarkEnd w:id="53"/>
-    <w:bookmarkStart w:id="128" w:name="references"/>
+    <w:bookmarkEnd w:id="54"/>
+    <w:bookmarkStart w:id="129" w:name="references"/>
     <w:p>
       <w:pPr>
         <w:pStyle w:val="Heading2"/>
@@ -4994,8 +5025,8 @@
         <w:t xml:space="preserve">References</w:t>
       </w:r>
     </w:p>
-    <w:bookmarkStart w:id="127" w:name="refs"/>
-    <w:bookmarkStart w:id="55" w:name="ref-greshake2023not"/>
+    <w:bookmarkStart w:id="128" w:name="refs"/>
+    <w:bookmarkStart w:id="56" w:name="ref-greshake2023not"/>
     <w:p>
       <w:pPr>
         <w:pStyle w:val="Bibliography"/>
@@ -5099,7 +5130,7 @@
       <w:r>
         <w:t xml:space="preserve">79–90 (Association for Computing Machinery, 2023). doi:</w:t>
       </w:r>
-      <w:hyperlink r:id="rId54">
+      <w:hyperlink r:id="rId55">
         <w:r>
           <w:rPr>
             <w:rStyle w:val="Hyperlink"/>
@@ -5111,8 +5142,8 @@
         <w:t xml:space="preserve">.</w:t>
       </w:r>
     </w:p>
-    <w:bookmarkEnd w:id="55"/>
-    <w:bookmarkStart w:id="57" w:name="ref-debenedetti2024agentdojo"/>
+    <w:bookmarkEnd w:id="56"/>
+    <w:bookmarkStart w:id="58" w:name="ref-debenedetti2024agentdojo"/>
     <w:p>
       <w:pPr>
         <w:pStyle w:val="Bibliography"/>
@@ -5142,7 +5173,7 @@
       <w:r>
         <w:t xml:space="preserve"> </w:t>
       </w:r>
-      <w:hyperlink r:id="rId56">
+      <w:hyperlink r:id="rId57">
         <w:r>
           <w:rPr>
             <w:rStyle w:val="Hyperlink"/>
@@ -5214,8 +5245,8 @@
         <w:t xml:space="preserve">vol. 37 (2024).</w:t>
       </w:r>
     </w:p>
-    <w:bookmarkEnd w:id="57"/>
-    <w:bookmarkStart w:id="59" w:name="ref-rahwan2019machine"/>
+    <w:bookmarkEnd w:id="58"/>
+    <w:bookmarkStart w:id="60" w:name="ref-rahwan2019machine"/>
     <w:p>
       <w:pPr>
         <w:pStyle w:val="Bibliography"/>
@@ -5245,7 +5276,7 @@
       <w:r>
         <w:t xml:space="preserve"> </w:t>
       </w:r>
-      <w:hyperlink r:id="rId58">
+      <w:hyperlink r:id="rId59">
         <w:r>
           <w:rPr>
             <w:rStyle w:val="Hyperlink"/>
@@ -5280,8 +5311,8 @@
         <w:t xml:space="preserve">, 477–486 (2019).</w:t>
       </w:r>
     </w:p>
-    <w:bookmarkEnd w:id="59"/>
-    <w:bookmarkStart w:id="61" w:name="ref-kumaran2026competing"/>
+    <w:bookmarkEnd w:id="60"/>
+    <w:bookmarkStart w:id="62" w:name="ref-kumaran2026competing"/>
     <w:p>
       <w:pPr>
         <w:pStyle w:val="Bibliography"/>
@@ -5333,7 +5364,7 @@
       <w:r>
         <w:t xml:space="preserve"> </w:t>
       </w:r>
-      <w:hyperlink r:id="rId60">
+      <w:hyperlink r:id="rId61">
         <w:r>
           <w:rPr>
             <w:rStyle w:val="Hyperlink"/>
@@ -5347,7 +5378,7 @@
       <w:r>
         <w:t xml:space="preserve">(2026) doi:</w:t>
       </w:r>
-      <w:hyperlink r:id="rId60">
+      <w:hyperlink r:id="rId61">
         <w:r>
           <w:rPr>
             <w:rStyle w:val="Hyperlink"/>
@@ -5359,8 +5390,8 @@
         <w:t xml:space="preserve">.</w:t>
       </w:r>
     </w:p>
-    <w:bookmarkEnd w:id="61"/>
-    <w:bookmarkStart w:id="63" w:name="ref-dentella2026biases"/>
+    <w:bookmarkEnd w:id="62"/>
+    <w:bookmarkStart w:id="64" w:name="ref-dentella2026biases"/>
     <w:p>
       <w:pPr>
         <w:pStyle w:val="Bibliography"/>
@@ -5402,7 +5433,7 @@
       <w:r>
         <w:t xml:space="preserve"> </w:t>
       </w:r>
-      <w:hyperlink r:id="rId62">
+      <w:hyperlink r:id="rId63">
         <w:r>
           <w:rPr>
             <w:rStyle w:val="Hyperlink"/>
@@ -5416,7 +5447,7 @@
       <w:r>
         <w:t xml:space="preserve">(2026) doi:</w:t>
       </w:r>
-      <w:hyperlink r:id="rId62">
+      <w:hyperlink r:id="rId63">
         <w:r>
           <w:rPr>
             <w:rStyle w:val="Hyperlink"/>
@@ -5428,8 +5459,8 @@
         <w:t xml:space="preserve">.</w:t>
       </w:r>
     </w:p>
-    <w:bookmarkEnd w:id="63"/>
-    <w:bookmarkStart w:id="65" w:name="ref-germani2025source"/>
+    <w:bookmarkEnd w:id="64"/>
+    <w:bookmarkStart w:id="66" w:name="ref-germani2025source"/>
     <w:p>
       <w:pPr>
         <w:pStyle w:val="Bibliography"/>
@@ -5459,7 +5490,7 @@
       <w:r>
         <w:t xml:space="preserve"> </w:t>
       </w:r>
-      <w:hyperlink r:id="rId64">
+      <w:hyperlink r:id="rId65">
         <w:r>
           <w:rPr>
             <w:rStyle w:val="Hyperlink"/>
@@ -5473,7 +5504,7 @@
       <w:r>
         <w:t xml:space="preserve">(2025) doi:</w:t>
       </w:r>
-      <w:hyperlink r:id="rId64">
+      <w:hyperlink r:id="rId65">
         <w:r>
           <w:rPr>
             <w:rStyle w:val="Hyperlink"/>
@@ -5485,8 +5516,8 @@
         <w:t xml:space="preserve">.</w:t>
       </w:r>
     </w:p>
-    <w:bookmarkEnd w:id="65"/>
-    <w:bookmarkStart w:id="67" w:name="ref-wallace2024instruction"/>
+    <w:bookmarkEnd w:id="66"/>
+    <w:bookmarkStart w:id="68" w:name="ref-wallace2024instruction"/>
     <w:p>
       <w:pPr>
         <w:pStyle w:val="Bibliography"/>
@@ -5528,7 +5559,7 @@
       <w:r>
         <w:t xml:space="preserve">to prioritize privileged instructions. (2024) doi:</w:t>
       </w:r>
-      <w:hyperlink r:id="rId66">
+      <w:hyperlink r:id="rId67">
         <w:r>
           <w:rPr>
             <w:rStyle w:val="Hyperlink"/>
@@ -5540,8 +5571,8 @@
         <w:t xml:space="preserve">.</w:t>
       </w:r>
     </w:p>
-    <w:bookmarkEnd w:id="67"/>
-    <w:bookmarkStart w:id="69" w:name="ref-zhan2024injecagent"/>
+    <w:bookmarkEnd w:id="68"/>
+    <w:bookmarkStart w:id="70" w:name="ref-zhan2024injecagent"/>
     <w:p>
       <w:pPr>
         <w:pStyle w:val="Bibliography"/>
@@ -5611,7 +5642,7 @@
       <w:r>
         <w:t xml:space="preserve">10471–10506 (Association for Computational Linguistics, 2024). doi:</w:t>
       </w:r>
-      <w:hyperlink r:id="rId68">
+      <w:hyperlink r:id="rId69">
         <w:r>
           <w:rPr>
             <w:rStyle w:val="Hyperlink"/>
@@ -5623,8 +5654,8 @@
         <w:t xml:space="preserve">.</w:t>
       </w:r>
     </w:p>
-    <w:bookmarkEnd w:id="69"/>
-    <w:bookmarkStart w:id="71" w:name="ref-chen2025chatinject"/>
+    <w:bookmarkEnd w:id="70"/>
+    <w:bookmarkStart w:id="72" w:name="ref-chen2025chatinject"/>
     <w:p>
       <w:pPr>
         <w:pStyle w:val="Bibliography"/>
@@ -5662,7 +5693,7 @@
       <w:r>
         <w:t xml:space="preserve">agents. (2025) doi:</w:t>
       </w:r>
-      <w:hyperlink r:id="rId70">
+      <w:hyperlink r:id="rId71">
         <w:r>
           <w:rPr>
             <w:rStyle w:val="Hyperlink"/>
@@ -5674,8 +5705,8 @@
         <w:t xml:space="preserve">.</w:t>
       </w:r>
     </w:p>
-    <w:bookmarkEnd w:id="71"/>
-    <w:bookmarkStart w:id="73" w:name="ref-cheng2026accommodation"/>
+    <w:bookmarkEnd w:id="72"/>
+    <w:bookmarkStart w:id="74" w:name="ref-cheng2026accommodation"/>
     <w:p>
       <w:pPr>
         <w:pStyle w:val="Bibliography"/>
@@ -5704,7 +5735,7 @@
       <w:r>
         <w:t xml:space="preserve">fail to challenge harmful beliefs. (2026) doi:</w:t>
       </w:r>
-      <w:hyperlink r:id="rId72">
+      <w:hyperlink r:id="rId73">
         <w:r>
           <w:rPr>
             <w:rStyle w:val="Hyperlink"/>
@@ -5716,8 +5747,8 @@
         <w:t xml:space="preserve">.</w:t>
       </w:r>
     </w:p>
-    <w:bookmarkEnd w:id="73"/>
-    <w:bookmarkStart w:id="75" w:name="ref-sharma2024sycophancy"/>
+    <w:bookmarkEnd w:id="74"/>
+    <w:bookmarkStart w:id="76" w:name="ref-sharma2024sycophancy"/>
     <w:p>
       <w:pPr>
         <w:pStyle w:val="Bibliography"/>
@@ -5747,7 +5778,7 @@
       <w:r>
         <w:t xml:space="preserve"> </w:t>
       </w:r>
-      <w:hyperlink r:id="rId74">
+      <w:hyperlink r:id="rId75">
         <w:r>
           <w:rPr>
             <w:rStyle w:val="Hyperlink"/>
@@ -5789,8 +5820,8 @@
         <w:t xml:space="preserve">(2024).</w:t>
       </w:r>
     </w:p>
-    <w:bookmarkEnd w:id="75"/>
-    <w:bookmarkStart w:id="77" w:name="ref-betley2026emergent"/>
+    <w:bookmarkEnd w:id="76"/>
+    <w:bookmarkStart w:id="78" w:name="ref-betley2026emergent"/>
     <w:p>
       <w:pPr>
         <w:pStyle w:val="Bibliography"/>
@@ -5820,7 +5851,7 @@
       <w:r>
         <w:t xml:space="preserve"> </w:t>
       </w:r>
-      <w:hyperlink r:id="rId76">
+      <w:hyperlink r:id="rId77">
         <w:r>
           <w:rPr>
             <w:rStyle w:val="Hyperlink"/>
@@ -5855,8 +5886,8 @@
         <w:t xml:space="preserve">, 584–589 (2026).</w:t>
       </w:r>
     </w:p>
-    <w:bookmarkEnd w:id="77"/>
-    <w:bookmarkStart w:id="79" w:name="ref-qi2024finetuning"/>
+    <w:bookmarkEnd w:id="78"/>
+    <w:bookmarkStart w:id="80" w:name="ref-qi2024finetuning"/>
     <w:p>
       <w:pPr>
         <w:pStyle w:val="Bibliography"/>
@@ -5916,7 +5947,7 @@
       <w:r>
         <w:t xml:space="preserve">(2024). doi:</w:t>
       </w:r>
-      <w:hyperlink r:id="rId78">
+      <w:hyperlink r:id="rId79">
         <w:r>
           <w:rPr>
             <w:rStyle w:val="Hyperlink"/>
@@ -5928,8 +5959,8 @@
         <w:t xml:space="preserve">.</w:t>
       </w:r>
     </w:p>
-    <w:bookmarkEnd w:id="79"/>
-    <w:bookmarkStart w:id="81" w:name="ref-cloud2026subliminal"/>
+    <w:bookmarkEnd w:id="80"/>
+    <w:bookmarkStart w:id="82" w:name="ref-cloud2026subliminal"/>
     <w:p>
       <w:pPr>
         <w:pStyle w:val="Bibliography"/>
@@ -5959,7 +5990,7 @@
       <w:r>
         <w:t xml:space="preserve"> </w:t>
       </w:r>
-      <w:hyperlink r:id="rId80">
+      <w:hyperlink r:id="rId81">
         <w:r>
           <w:rPr>
             <w:rStyle w:val="Hyperlink"/>
@@ -5994,8 +6025,8 @@
         <w:t xml:space="preserve">, 615–621 (2026).</w:t>
       </w:r>
     </w:p>
-    <w:bookmarkEnd w:id="81"/>
-    <w:bookmarkStart w:id="83" w:name="ref-taylor2025school"/>
+    <w:bookmarkEnd w:id="82"/>
+    <w:bookmarkStart w:id="84" w:name="ref-taylor2025school"/>
     <w:p>
       <w:pPr>
         <w:pStyle w:val="Bibliography"/>
@@ -6021,7 +6052,7 @@
       <w:r>
         <w:t xml:space="preserve">. (2025) doi:</w:t>
       </w:r>
-      <w:hyperlink r:id="rId82">
+      <w:hyperlink r:id="rId83">
         <w:r>
           <w:rPr>
             <w:rStyle w:val="Hyperlink"/>
@@ -6033,8 +6064,8 @@
         <w:t xml:space="preserve">.</w:t>
       </w:r>
     </w:p>
-    <w:bookmarkEnd w:id="83"/>
-    <w:bookmarkStart w:id="85" w:name="ref-bai2022constitutional"/>
+    <w:bookmarkEnd w:id="84"/>
+    <w:bookmarkStart w:id="86" w:name="ref-bai2022constitutional"/>
     <w:p>
       <w:pPr>
         <w:pStyle w:val="Bibliography"/>
@@ -6085,7 +6116,7 @@
       <w:r>
         <w:t xml:space="preserve">feedback. (2022) doi:</w:t>
       </w:r>
-      <w:hyperlink r:id="rId84">
+      <w:hyperlink r:id="rId85">
         <w:r>
           <w:rPr>
             <w:rStyle w:val="Hyperlink"/>
@@ -6097,8 +6128,8 @@
         <w:t xml:space="preserve">.</w:t>
       </w:r>
     </w:p>
-    <w:bookmarkEnd w:id="85"/>
-    <w:bookmarkStart w:id="87" w:name="ref-ouyang2022training"/>
+    <w:bookmarkEnd w:id="86"/>
+    <w:bookmarkStart w:id="88" w:name="ref-ouyang2022training"/>
     <w:p>
       <w:pPr>
         <w:pStyle w:val="Bibliography"/>
@@ -6128,7 +6159,7 @@
       <w:r>
         <w:t xml:space="preserve"> </w:t>
       </w:r>
-      <w:hyperlink r:id="rId86">
+      <w:hyperlink r:id="rId87">
         <w:r>
           <w:rPr>
             <w:rStyle w:val="Hyperlink"/>
@@ -6170,8 +6201,8 @@
         <w:t xml:space="preserve">vol. 35 27730–27744 (2022).</w:t>
       </w:r>
     </w:p>
-    <w:bookmarkEnd w:id="87"/>
-    <w:bookmarkStart w:id="88" w:name="ref-petty1986elaboration"/>
+    <w:bookmarkEnd w:id="88"/>
+    <w:bookmarkStart w:id="89" w:name="ref-petty1986elaboration"/>
     <w:p>
       <w:pPr>
         <w:pStyle w:val="Bibliography"/>
@@ -6212,8 +6243,8 @@
         <w:t xml:space="preserve">, 123–205 (1986).</w:t>
       </w:r>
     </w:p>
-    <w:bookmarkEnd w:id="88"/>
-    <w:bookmarkStart w:id="90" w:name="ref-tversky1974judgment"/>
+    <w:bookmarkEnd w:id="89"/>
+    <w:bookmarkStart w:id="91" w:name="ref-tversky1974judgment"/>
     <w:p>
       <w:pPr>
         <w:pStyle w:val="Bibliography"/>
@@ -6233,7 +6264,7 @@
       <w:r>
         <w:t xml:space="preserve"> </w:t>
       </w:r>
-      <w:hyperlink r:id="rId89">
+      <w:hyperlink r:id="rId90">
         <w:r>
           <w:rPr>
             <w:rStyle w:val="Hyperlink"/>
@@ -6268,8 +6299,8 @@
         <w:t xml:space="preserve">, 1124–1131 (1974).</w:t>
       </w:r>
     </w:p>
-    <w:bookmarkEnd w:id="90"/>
-    <w:bookmarkStart w:id="92" w:name="ref-wei2022emergent"/>
+    <w:bookmarkEnd w:id="91"/>
+    <w:bookmarkStart w:id="93" w:name="ref-wei2022emergent"/>
     <w:p>
       <w:pPr>
         <w:pStyle w:val="Bibliography"/>
@@ -6312,7 +6343,7 @@
       <w:r>
         <w:t xml:space="preserve"> </w:t>
       </w:r>
-      <w:hyperlink r:id="rId91">
+      <w:hyperlink r:id="rId92">
         <w:r>
           <w:rPr>
             <w:rStyle w:val="Hyperlink"/>
@@ -6327,8 +6358,8 @@
         <w:t xml:space="preserve">(2022).</w:t>
       </w:r>
     </w:p>
-    <w:bookmarkEnd w:id="92"/>
-    <w:bookmarkStart w:id="93" w:name="ref-lewis2020rag"/>
+    <w:bookmarkEnd w:id="93"/>
+    <w:bookmarkStart w:id="94" w:name="ref-lewis2020rag"/>
     <w:p>
       <w:pPr>
         <w:pStyle w:val="Bibliography"/>
@@ -6387,8 +6418,8 @@
         <w:t xml:space="preserve">(2020).</w:t>
       </w:r>
     </w:p>
-    <w:bookmarkEnd w:id="93"/>
-    <w:bookmarkStart w:id="95" w:name="ref-shi2023irrelevant"/>
+    <w:bookmarkEnd w:id="94"/>
+    <w:bookmarkStart w:id="96" w:name="ref-shi2023irrelevant"/>
     <w:p>
       <w:pPr>
         <w:pStyle w:val="Bibliography"/>
@@ -6418,7 +6449,7 @@
       <w:r>
         <w:t xml:space="preserve"> </w:t>
       </w:r>
-      <w:hyperlink r:id="rId94">
+      <w:hyperlink r:id="rId95">
         <w:r>
           <w:rPr>
             <w:rStyle w:val="Hyperlink"/>
@@ -6446,8 +6477,8 @@
         <w:t xml:space="preserve">(2023).</w:t>
       </w:r>
     </w:p>
-    <w:bookmarkEnd w:id="95"/>
-    <w:bookmarkStart w:id="97" w:name="ref-greenblatt2024alignment"/>
+    <w:bookmarkEnd w:id="96"/>
+    <w:bookmarkStart w:id="98" w:name="ref-greenblatt2024alignment"/>
     <w:p>
       <w:pPr>
         <w:pStyle w:val="Bibliography"/>
@@ -6477,7 +6508,7 @@
       <w:r>
         <w:t xml:space="preserve"> Alignment faking in large language models. (2024) doi:</w:t>
       </w:r>
-      <w:hyperlink r:id="rId96">
+      <w:hyperlink r:id="rId97">
         <w:r>
           <w:rPr>
             <w:rStyle w:val="Hyperlink"/>
@@ -6489,8 +6520,8 @@
         <w:t xml:space="preserve">.</w:t>
       </w:r>
     </w:p>
-    <w:bookmarkEnd w:id="97"/>
-    <w:bookmarkStart w:id="99" w:name="ref-hubinger2024sleeper"/>
+    <w:bookmarkEnd w:id="98"/>
+    <w:bookmarkStart w:id="100" w:name="ref-hubinger2024sleeper"/>
     <w:p>
       <w:pPr>
         <w:pStyle w:val="Bibliography"/>
@@ -6532,7 +6563,7 @@
       <w:r>
         <w:t xml:space="preserve">that persist through safety training. (2024) doi:</w:t>
       </w:r>
-      <w:hyperlink r:id="rId98">
+      <w:hyperlink r:id="rId99">
         <w:r>
           <w:rPr>
             <w:rStyle w:val="Hyperlink"/>
@@ -6544,8 +6575,8 @@
         <w:t xml:space="preserve">.</w:t>
       </w:r>
     </w:p>
-    <w:bookmarkEnd w:id="99"/>
-    <w:bookmarkStart w:id="101" w:name="ref-perez2022discovering"/>
+    <w:bookmarkEnd w:id="100"/>
+    <w:bookmarkStart w:id="102" w:name="ref-perez2022discovering"/>
     <w:p>
       <w:pPr>
         <w:pStyle w:val="Bibliography"/>
@@ -6575,7 +6606,7 @@
       <w:r>
         <w:t xml:space="preserve"> Discovering language model behaviors with model-written evaluations. (2022) doi:</w:t>
       </w:r>
-      <w:hyperlink r:id="rId100">
+      <w:hyperlink r:id="rId101">
         <w:r>
           <w:rPr>
             <w:rStyle w:val="Hyperlink"/>
@@ -6587,8 +6618,8 @@
         <w:t xml:space="preserve">.</w:t>
       </w:r>
     </w:p>
-    <w:bookmarkEnd w:id="101"/>
-    <w:bookmarkStart w:id="103" w:name="ref-chua2025thought"/>
+    <w:bookmarkEnd w:id="102"/>
+    <w:bookmarkStart w:id="104" w:name="ref-chua2025thought"/>
     <w:p>
       <w:pPr>
         <w:pStyle w:val="Bibliography"/>
@@ -6605,7 +6636,7 @@
       <w:r>
         <w:t xml:space="preserve">Chua, J., Betley, J., Taylor, M. &amp; Evans, O. Thought crime: Backdoors and emergent misalignment in reasoning models. (2025) doi:</w:t>
       </w:r>
-      <w:hyperlink r:id="rId102">
+      <w:hyperlink r:id="rId103">
         <w:r>
           <w:rPr>
             <w:rStyle w:val="Hyperlink"/>
@@ -6617,8 +6648,8 @@
         <w:t xml:space="preserve">.</w:t>
       </w:r>
     </w:p>
-    <w:bookmarkEnd w:id="103"/>
-    <w:bookmarkStart w:id="105" w:name="ref-steyvers2025what"/>
+    <w:bookmarkEnd w:id="104"/>
+    <w:bookmarkStart w:id="106" w:name="ref-steyvers2025what"/>
     <w:p>
       <w:pPr>
         <w:pStyle w:val="Bibliography"/>
@@ -6648,7 +6679,7 @@
       <w:r>
         <w:t xml:space="preserve"> </w:t>
       </w:r>
-      <w:hyperlink r:id="rId104">
+      <w:hyperlink r:id="rId105">
         <w:r>
           <w:rPr>
             <w:rStyle w:val="Hyperlink"/>
@@ -6683,8 +6714,8 @@
         <w:t xml:space="preserve">, 221–231 (2025).</w:t>
       </w:r>
     </w:p>
-    <w:bookmarkEnd w:id="105"/>
-    <w:bookmarkStart w:id="107" w:name="ref-chen2025persona"/>
+    <w:bookmarkEnd w:id="106"/>
+    <w:bookmarkStart w:id="108" w:name="ref-chen2025persona"/>
     <w:p>
       <w:pPr>
         <w:pStyle w:val="Bibliography"/>
@@ -6701,7 +6732,7 @@
       <w:r>
         <w:t xml:space="preserve">Chen, R., Arditi, A., Sleight, H., Evans, O. &amp; Lindsey, J. Persona vectors: Monitoring and controlling character traits in language models. (2025) doi:</w:t>
       </w:r>
-      <w:hyperlink r:id="rId106">
+      <w:hyperlink r:id="rId107">
         <w:r>
           <w:rPr>
             <w:rStyle w:val="Hyperlink"/>
@@ -6713,8 +6744,8 @@
         <w:t xml:space="preserve">.</w:t>
       </w:r>
     </w:p>
-    <w:bookmarkEnd w:id="107"/>
-    <w:bookmarkStart w:id="109" w:name="ref-marks2025auditing"/>
+    <w:bookmarkEnd w:id="108"/>
+    <w:bookmarkStart w:id="110" w:name="ref-marks2025auditing"/>
     <w:p>
       <w:pPr>
         <w:pStyle w:val="Bibliography"/>
@@ -6744,7 +6775,7 @@
       <w:r>
         <w:t xml:space="preserve"> Auditing language models for hidden objectives. (2025) doi:</w:t>
       </w:r>
-      <w:hyperlink r:id="rId108">
+      <w:hyperlink r:id="rId109">
         <w:r>
           <w:rPr>
             <w:rStyle w:val="Hyperlink"/>
@@ -6756,8 +6787,8 @@
         <w:t xml:space="preserve">.</w:t>
       </w:r>
     </w:p>
-    <w:bookmarkEnd w:id="109"/>
-    <w:bookmarkStart w:id="111" w:name="ref-sperber2010vigilance"/>
+    <w:bookmarkEnd w:id="110"/>
+    <w:bookmarkStart w:id="112" w:name="ref-sperber2010vigilance"/>
     <w:p>
       <w:pPr>
         <w:pStyle w:val="Bibliography"/>
@@ -6787,7 +6818,7 @@
       <w:r>
         <w:t xml:space="preserve"> </w:t>
       </w:r>
-      <w:hyperlink r:id="rId110">
+      <w:hyperlink r:id="rId111">
         <w:r>
           <w:rPr>
             <w:rStyle w:val="Hyperlink"/>
@@ -6822,8 +6853,8 @@
         <w:t xml:space="preserve">, 359–393 (2010).</w:t>
       </w:r>
     </w:p>
-    <w:bookmarkEnd w:id="111"/>
-    <w:bookmarkStart w:id="113" w:name="ref-zou2025poisonedrag"/>
+    <w:bookmarkEnd w:id="112"/>
+    <w:bookmarkStart w:id="114" w:name="ref-zou2025poisonedrag"/>
     <w:p>
       <w:pPr>
         <w:pStyle w:val="Bibliography"/>
@@ -6843,7 +6874,7 @@
       <w:r>
         <w:t xml:space="preserve"> </w:t>
       </w:r>
-      <w:hyperlink r:id="rId112">
+      <w:hyperlink r:id="rId113">
         <w:r>
           <w:rPr>
             <w:rStyle w:val="Hyperlink"/>
@@ -6877,8 +6908,8 @@
         <w:t xml:space="preserve">(2025).</w:t>
       </w:r>
     </w:p>
-    <w:bookmarkEnd w:id="113"/>
-    <w:bookmarkStart w:id="114" w:name="ref-mata2023avianca"/>
+    <w:bookmarkEnd w:id="114"/>
+    <w:bookmarkStart w:id="115" w:name="ref-mata2023avianca"/>
     <w:p>
       <w:pPr>
         <w:pStyle w:val="Bibliography"/>
@@ -6905,8 +6936,8 @@
         <w:t xml:space="preserve">June 22, 2023): Opinion and order on sanctions. (2023).</w:t>
       </w:r>
     </w:p>
-    <w:bookmarkEnd w:id="114"/>
-    <w:bookmarkStart w:id="116" w:name="ref-dahl2024hallucinating"/>
+    <w:bookmarkEnd w:id="115"/>
+    <w:bookmarkStart w:id="117" w:name="ref-dahl2024hallucinating"/>
     <w:p>
       <w:pPr>
         <w:pStyle w:val="Bibliography"/>
@@ -6936,7 +6967,7 @@
       <w:r>
         <w:t xml:space="preserve"> </w:t>
       </w:r>
-      <w:hyperlink r:id="rId115">
+      <w:hyperlink r:id="rId116">
         <w:r>
           <w:rPr>
             <w:rStyle w:val="Hyperlink"/>
@@ -6951,8 +6982,8 @@
         <w:t xml:space="preserve">(2024).</w:t>
       </w:r>
     </w:p>
-    <w:bookmarkEnd w:id="116"/>
-    <w:bookmarkStart w:id="118" w:name="ref-shumailov2024curse"/>
+    <w:bookmarkEnd w:id="117"/>
+    <w:bookmarkStart w:id="119" w:name="ref-shumailov2024curse"/>
     <w:p>
       <w:pPr>
         <w:pStyle w:val="Bibliography"/>
@@ -6982,7 +7013,7 @@
       <w:r>
         <w:t xml:space="preserve"> </w:t>
       </w:r>
-      <w:hyperlink r:id="rId117">
+      <w:hyperlink r:id="rId118">
         <w:r>
           <w:rPr>
             <w:rStyle w:val="Hyperlink"/>
@@ -7029,8 +7060,8 @@
         <w:t xml:space="preserve">, 755–759 (2024).</w:t>
       </w:r>
     </w:p>
-    <w:bookmarkEnd w:id="118"/>
-    <w:bookmarkStart w:id="120" w:name="ref-cheung2025amplified"/>
+    <w:bookmarkEnd w:id="119"/>
+    <w:bookmarkStart w:id="121" w:name="ref-cheung2025amplified"/>
     <w:p>
       <w:pPr>
         <w:pStyle w:val="Bibliography"/>
@@ -7060,7 +7091,7 @@
       <w:r>
         <w:t xml:space="preserve"> </w:t>
       </w:r>
-      <w:hyperlink r:id="rId119">
+      <w:hyperlink r:id="rId120">
         <w:r>
           <w:rPr>
             <w:rStyle w:val="Hyperlink"/>
@@ -7074,7 +7105,7 @@
       <w:r>
         <w:t xml:space="preserve">(2025) doi:</w:t>
       </w:r>
-      <w:hyperlink r:id="rId119">
+      <w:hyperlink r:id="rId120">
         <w:r>
           <w:rPr>
             <w:rStyle w:val="Hyperlink"/>
@@ -7086,8 +7117,8 @@
         <w:t xml:space="preserve">.</w:t>
       </w:r>
     </w:p>
-    <w:bookmarkEnd w:id="120"/>
-    <w:bookmarkStart w:id="122" w:name="ref-anthropic2024claude"/>
+    <w:bookmarkEnd w:id="121"/>
+    <w:bookmarkStart w:id="123" w:name="ref-anthropic2024claude"/>
     <w:p>
       <w:pPr>
         <w:pStyle w:val="Bibliography"/>
@@ -7107,7 +7138,7 @@
       <w:r>
         <w:t xml:space="preserve"> </w:t>
       </w:r>
-      <w:hyperlink r:id="rId121">
+      <w:hyperlink r:id="rId122">
         <w:r>
           <w:rPr>
             <w:rStyle w:val="Hyperlink"/>
@@ -7191,8 +7222,8 @@
         <w:t xml:space="preserve">. (2024).</w:t>
       </w:r>
     </w:p>
-    <w:bookmarkEnd w:id="122"/>
-    <w:bookmarkStart w:id="124" w:name="ref-openai2024gpt4o"/>
+    <w:bookmarkEnd w:id="123"/>
+    <w:bookmarkStart w:id="125" w:name="ref-openai2024gpt4o"/>
     <w:p>
       <w:pPr>
         <w:pStyle w:val="Bibliography"/>
@@ -7212,7 +7243,7 @@
       <w:r>
         <w:t xml:space="preserve"> </w:t>
       </w:r>
-      <w:hyperlink r:id="rId123">
+      <w:hyperlink r:id="rId124">
         <w:r>
           <w:rPr>
             <w:rStyle w:val="Hyperlink"/>
@@ -7236,8 +7267,8 @@
         <w:t xml:space="preserve">. (2024).</w:t>
       </w:r>
     </w:p>
-    <w:bookmarkEnd w:id="124"/>
-    <w:bookmarkStart w:id="126" w:name="ref-googledeepmind2024gemini"/>
+    <w:bookmarkEnd w:id="125"/>
+    <w:bookmarkStart w:id="127" w:name="ref-googledeepmind2024gemini"/>
     <w:p>
       <w:pPr>
         <w:pStyle w:val="Bibliography"/>
@@ -7257,7 +7288,7 @@
       <w:r>
         <w:t xml:space="preserve"> </w:t>
       </w:r>
-      <w:hyperlink r:id="rId125">
+      <w:hyperlink r:id="rId126">
         <w:r>
           <w:rPr>
             <w:rStyle w:val="Hyperlink"/>
@@ -7293,9 +7324,9 @@
         <w:t xml:space="preserve">. (2024).</w:t>
       </w:r>
     </w:p>
-    <w:bookmarkEnd w:id="126"/>
     <w:bookmarkEnd w:id="127"/>
     <w:bookmarkEnd w:id="128"/>
+    <w:bookmarkEnd w:id="129"/>
     <w:sectPr>
       <w:pgSz w:h="15840" w:w="12240"/>
       <w:pgMar w:bottom="1440" w:footer="720" w:gutter="0" w:header="720" w:left="1440" w:right="1440" w:top="1440"/>

</xml_diff>